<commit_message>
Refresh resumes and version PDF links
</commit_message>
<xml_diff>
--- a/Job-Resume/Resume-Cloud-Security-Engineer.docx
+++ b/Job-Resume/Resume-Cloud-Security-Engineer.docx
@@ -105,7 +105,7 @@
           <w:sz w:val="18"/>
           <w:szCs w:val="18"/>
         </w:rPr>
-        <w:t xml:space="preserve">Graduate Research Assistant at Gannon University developing first-author work in intelligent firewall systems, distributed infrastructure protection, and deployable cloud defense models.</w:t>
+        <w:t xml:space="preserve">Current first-author research focuses on intelligent firewall systems, distributed infrastructure protection, and deployable cloud defense models.</w:t>
       </w:r>
     </w:p>
     <w:p>
@@ -123,158 +123,15 @@
     </w:p>
     <w:p>
       <w:pPr>
-        <w:spacing w:before="0" w:after="50"/>
-        <w:jc w:val="both"/>
-      </w:pPr>
-      <w:r>
-        <w:rPr>
-          <w:sz w:val="18"/>
-          <w:szCs w:val="18"/>
-        </w:rPr>
-        <w:t xml:space="preserve">- Cloud Security and Hybrid Infrastructure Protection</w:t>
-      </w:r>
-    </w:p>
-    <w:p>
-      <w:pPr>
-        <w:spacing w:before="0" w:after="50"/>
-        <w:jc w:val="both"/>
-      </w:pPr>
-      <w:r>
-        <w:rPr>
-          <w:sz w:val="18"/>
-          <w:szCs w:val="18"/>
-        </w:rPr>
-        <w:t xml:space="preserve">- Serverless Security and Zero Trust Concepts</w:t>
-      </w:r>
-    </w:p>
-    <w:p>
-      <w:pPr>
-        <w:spacing w:before="0" w:after="50"/>
-        <w:jc w:val="both"/>
-      </w:pPr>
-      <w:r>
-        <w:rPr>
-          <w:sz w:val="18"/>
-          <w:szCs w:val="18"/>
-        </w:rPr>
-        <w:t xml:space="preserve">- Firewall Policy Management and Threat Detection</w:t>
-      </w:r>
-    </w:p>
-    <w:p>
-      <w:pPr>
-        <w:spacing w:before="0" w:after="50"/>
-        <w:jc w:val="both"/>
-      </w:pPr>
-      <w:r>
-        <w:rPr>
-          <w:sz w:val="18"/>
-          <w:szCs w:val="18"/>
-        </w:rPr>
-        <w:t xml:space="preserve">- Identity Access Control and Active Directory</w:t>
-      </w:r>
-    </w:p>
-    <w:p>
-      <w:pPr>
-        <w:spacing w:before="0" w:after="50"/>
-        <w:jc w:val="both"/>
-      </w:pPr>
-      <w:r>
-        <w:rPr>
-          <w:sz w:val="18"/>
-          <w:szCs w:val="18"/>
-        </w:rPr>
-        <w:t xml:space="preserve">- Routing, Switching, VPN, NAT, and ACL</w:t>
-      </w:r>
-    </w:p>
-    <w:p>
-      <w:pPr>
-        <w:spacing w:before="0" w:after="50"/>
-        <w:jc w:val="both"/>
-      </w:pPr>
-      <w:r>
-        <w:rPr>
-          <w:sz w:val="18"/>
-          <w:szCs w:val="18"/>
-        </w:rPr>
-        <w:t xml:space="preserve">- Linux and Windows Server Administration</w:t>
-      </w:r>
-    </w:p>
-    <w:p>
-      <w:pPr>
-        <w:spacing w:before="0" w:after="50"/>
-        <w:jc w:val="both"/>
-      </w:pPr>
-      <w:r>
-        <w:rPr>
-          <w:sz w:val="18"/>
-          <w:szCs w:val="18"/>
-        </w:rPr>
-        <w:t xml:space="preserve">- AWS Fundamentals: Lambda, WAF, EC2, IAM, S3</w:t>
-      </w:r>
-    </w:p>
-    <w:p>
-      <w:pPr>
-        <w:spacing w:before="0" w:after="50"/>
-        <w:jc w:val="both"/>
-      </w:pPr>
-      <w:r>
-        <w:rPr>
-          <w:sz w:val="18"/>
-          <w:szCs w:val="18"/>
-        </w:rPr>
-        <w:t xml:space="preserve">- Secure Automation and Python Scripting</w:t>
-      </w:r>
-    </w:p>
-    <w:p>
-      <w:pPr>
-        <w:spacing w:before="0" w:after="50"/>
-        <w:jc w:val="both"/>
-      </w:pPr>
-      <w:r>
-        <w:rPr>
-          <w:sz w:val="18"/>
-          <w:szCs w:val="18"/>
-        </w:rPr>
-        <w:t xml:space="preserve">- Distributed Infrastructure Defense</w:t>
-      </w:r>
-    </w:p>
-    <w:p>
-      <w:pPr>
-        <w:spacing w:before="0" w:after="50"/>
-        <w:jc w:val="both"/>
-      </w:pPr>
-      <w:r>
-        <w:rPr>
-          <w:sz w:val="18"/>
-          <w:szCs w:val="18"/>
-        </w:rPr>
-        <w:t xml:space="preserve">- Research-Backed Security Engineering</w:t>
-      </w:r>
-    </w:p>
-    <w:p>
-      <w:pPr>
-        <w:spacing w:before="0" w:after="50"/>
-        <w:jc w:val="both"/>
-      </w:pPr>
-      <w:r>
-        <w:rPr>
-          <w:sz w:val="18"/>
-          <w:szCs w:val="18"/>
-        </w:rPr>
-        <w:t xml:space="preserve">- Incident Response and Infrastructure Troubleshooting</w:t>
-      </w:r>
-    </w:p>
-    <w:p>
-      <w:pPr>
-        <w:spacing w:before="0" w:after="50"/>
-        <w:jc w:val="both"/>
-      </w:pPr>
-      <w:r>
-        <w:rPr>
-          <w:sz w:val="18"/>
-          <w:szCs w:val="18"/>
-        </w:rPr>
-        <w:t xml:space="preserve">- CCNA, JNCIA, and MTCNA</w:t>
+        <w:spacing w:before="0" w:after="70"/>
+        <w:jc w:val="both"/>
+      </w:pPr>
+      <w:r>
+        <w:rPr>
+          <w:sz w:val="18"/>
+          <w:szCs w:val="18"/>
+        </w:rPr>
+        <w:t xml:space="preserve">Cloud Security and Hybrid Infrastructure Protection; Serverless Security and Zero Trust Concepts; Firewall Policy Management and Threat Detection; Identity Access Control and Active Directory; Routing, Switching, VPN, NAT, and ACL; Linux and Windows Server Administration; AWS Fundamentals: Lambda, WAF, EC2, IAM, S3; Secure Automation and Python Scripting; Distributed Infrastructure Defense; Research-Backed Security Engineering; Incident Response and Infrastructure Troubleshooting; and CCNA, JNCIA, and MTCNA.</w:t>
       </w:r>
     </w:p>
     <w:p>
@@ -326,33 +183,33 @@
           <w:sz w:val="18"/>
           <w:szCs w:val="18"/>
         </w:rPr>
-        <w:t xml:space="preserve">- Designs and evaluates research systems for secure data transmission, traffic-flow optimization, and infrastructure-aware network defense.</w:t>
-      </w:r>
-    </w:p>
-    <w:p>
-      <w:pPr>
-        <w:spacing w:before="0" w:after="50"/>
-        <w:jc w:val="both"/>
-      </w:pPr>
-      <w:r>
-        <w:rPr>
-          <w:sz w:val="18"/>
-          <w:szCs w:val="18"/>
-        </w:rPr>
-        <w:t xml:space="preserve">- Builds first-author security projects around serverless intelligent firewalls, Zero Trust automation, and cross-cloud protection models.</w:t>
-      </w:r>
-    </w:p>
-    <w:p>
-      <w:pPr>
-        <w:spacing w:before="0" w:after="50"/>
-        <w:jc w:val="both"/>
-      </w:pPr>
-      <w:r>
-        <w:rPr>
-          <w:sz w:val="18"/>
-          <w:szCs w:val="18"/>
-        </w:rPr>
-        <w:t xml:space="preserve">- Authors and co-authors research papers in cloud security, edge systems, enterprise AI, and distributed infrastructure security.</w:t>
+        <w:t xml:space="preserve">- Design and evaluate research systems for secure data transmission, traffic-flow optimization, and infrastructure-aware network defense.</w:t>
+      </w:r>
+    </w:p>
+    <w:p>
+      <w:pPr>
+        <w:spacing w:before="0" w:after="50"/>
+        <w:jc w:val="both"/>
+      </w:pPr>
+      <w:r>
+        <w:rPr>
+          <w:sz w:val="18"/>
+          <w:szCs w:val="18"/>
+        </w:rPr>
+        <w:t xml:space="preserve">- Lead first-author security projects around serverless intelligent firewalls, Zero Trust automation, and cross-cloud protection models.</w:t>
+      </w:r>
+    </w:p>
+    <w:p>
+      <w:pPr>
+        <w:spacing w:before="0" w:after="50"/>
+        <w:jc w:val="both"/>
+      </w:pPr>
+      <w:r>
+        <w:rPr>
+          <w:sz w:val="18"/>
+          <w:szCs w:val="18"/>
+        </w:rPr>
+        <w:t xml:space="preserve">- Write and co-author research papers in cloud security, edge systems, enterprise AI, and distributed infrastructure security.</w:t>
       </w:r>
     </w:p>
     <w:p>
@@ -404,7 +261,7 @@
           <w:sz w:val="18"/>
           <w:szCs w:val="18"/>
         </w:rPr>
-        <w:t xml:space="preserve">- Translated technical security topics into hands-on lessons that matched industry practice and certification-oriented learning paths.</w:t>
+        <w:t xml:space="preserve">- Translated technical security topics into hands-on lessons aligned with industry practice and certification-oriented learning paths.</w:t>
       </w:r>
     </w:p>
     <w:p>
@@ -456,7 +313,7 @@
           <w:sz w:val="18"/>
           <w:szCs w:val="18"/>
         </w:rPr>
-        <w:t xml:space="preserve">- Planned and supported LAN/WAN upgrades, access control improvements, and day-to-day infrastructure operations for multi-department business environments.</w:t>
+        <w:t xml:space="preserve">- Planned and supported LAN/WAN upgrades, access-control improvements, and day-to-day infrastructure operations across multiple business units.</w:t>
       </w:r>
     </w:p>
     <w:p>
@@ -534,7 +391,7 @@
           <w:sz w:val="18"/>
           <w:szCs w:val="18"/>
         </w:rPr>
-        <w:t xml:space="preserve">- Troubleshot fiber, wireless, and routed network incidents while documenting configurations and escalation steps for faster recovery.</w:t>
+        <w:t xml:space="preserve">- Troubleshot fiber, wireless, and routed network incidents and documented configurations and escalation steps to speed up recovery.</w:t>
       </w:r>
     </w:p>
     <w:p>
@@ -586,20 +443,20 @@
           <w:sz w:val="18"/>
           <w:szCs w:val="18"/>
         </w:rPr>
-        <w:t xml:space="preserve">- Brings practical experience in secure operations, access control, troubleshooting, and service reliability to cloud-focused security work.</w:t>
-      </w:r>
-    </w:p>
-    <w:p>
-      <w:pPr>
-        <w:spacing w:before="0" w:after="50"/>
-        <w:jc w:val="both"/>
-      </w:pPr>
-      <w:r>
-        <w:rPr>
-          <w:sz w:val="18"/>
-          <w:szCs w:val="18"/>
-        </w:rPr>
-        <w:t xml:space="preserve">- Works comfortably at the boundary between infrastructure operations, security engineering, and research-driven implementation.</w:t>
+        <w:t xml:space="preserve">- Applied practical experience in secure operations, access control, troubleshooting, and service reliability to cloud-focused security work.</w:t>
+      </w:r>
+    </w:p>
+    <w:p>
+      <w:pPr>
+        <w:spacing w:before="0" w:after="50"/>
+        <w:jc w:val="both"/>
+      </w:pPr>
+      <w:r>
+        <w:rPr>
+          <w:sz w:val="18"/>
+          <w:szCs w:val="18"/>
+        </w:rPr>
+        <w:t xml:space="preserve">- Worked at the boundary between infrastructure operations, security engineering, and research-driven implementation.</w:t>
       </w:r>
     </w:p>
     <w:p>

</xml_diff>